<commit_message>
Poenoti izraz upravljanje različic
</commit_message>
<xml_diff>
--- a/predavanja/01-besedilne-datoteke/o-predmetu.docx
+++ b/predavanja/01-besedilne-datoteke/o-predmetu.docx
@@ -755,28 +755,28 @@
                 <w:rFonts w:ascii="Segoe UI" w:hAnsi="Segoe UI" w:cs="Segoe UI"/>
                 <w:color w:val="1D2125"/>
               </w:rPr>
-              <w:t>Nadzor različic</w:t>
-            </w:r>
-          </w:p>
-        </w:tc>
-        <w:tc>
-          <w:tcPr>
-            <w:tcW w:w="2254" w:type="dxa"/>
-            <w:vAlign w:val="center"/>
-          </w:tcPr>
-          <w:p>
-            <w:pPr>
-              <w:rPr>
-                <w:rFonts w:ascii="Segoe UI" w:hAnsi="Segoe UI" w:cs="Segoe UI"/>
-                <w:color w:val="1D2125"/>
-              </w:rPr>
-            </w:pPr>
-            <w:r>
-              <w:rPr>
-                <w:rFonts w:ascii="Segoe UI" w:hAnsi="Segoe UI" w:cs="Segoe UI"/>
-                <w:color w:val="1D2125"/>
-              </w:rPr>
-              <w:t>Nadzor različic</w:t>
+              <w:t>Upravljanje različic</w:t>
+            </w:r>
+          </w:p>
+        </w:tc>
+        <w:tc>
+          <w:tcPr>
+            <w:tcW w:w="2254" w:type="dxa"/>
+            <w:vAlign w:val="center"/>
+          </w:tcPr>
+          <w:p>
+            <w:pPr>
+              <w:rPr>
+                <w:rFonts w:ascii="Segoe UI" w:hAnsi="Segoe UI" w:cs="Segoe UI"/>
+                <w:color w:val="1D2125"/>
+              </w:rPr>
+            </w:pPr>
+            <w:r>
+              <w:rPr>
+                <w:rFonts w:ascii="Segoe UI" w:hAnsi="Segoe UI" w:cs="Segoe UI"/>
+                <w:color w:val="1D2125"/>
+              </w:rPr>
+              <w:t>Upravljanje različic</w:t>
             </w:r>
           </w:p>
         </w:tc>

</xml_diff>